<commit_message>
feat: expand to 175 daily lessons per course (one per instructional day)
- Chemistry: 175 daily lessons, 434 .docx documents across 11 units
- Physics: 175 daily lessons, 435 .docx documents across 11 units
- Multi-day lessons split into individual daily lessons with distinct
  learning targets, do nows, circle prompts, and 5E sequences
- Added gap-filler lessons (labs, practice days) to fill missing days
- Added expand_daily.py and fill_gaps.py scripts

Co-Authored-By: Claude Opus 4.6 <noreply@anthropic.com>
</commit_message>
<xml_diff>
--- a/Chemistry/Units/01-Matter Measurement and Lab Safety/Unit Plan.docx
+++ b/Chemistry/Units/01-Matter Measurement and Lab Safety/Unit Plan.docx
@@ -316,7 +316,7 @@
                 <w:sz w:val="22"/>
                 <w:u w:val="none"/>
               </w:rPr>
-              <w:t>Classifying Matter: Pure Substances vs. Mixtures</w:t>
+              <w:t>Classifying Matter: Pure Substances vs. Mixtures (Day 1 of 2)</w:t>
             </w:r>
           </w:p>
         </w:tc>
@@ -335,7 +335,7 @@
                 <w:sz w:val="22"/>
                 <w:u w:val="none"/>
               </w:rPr>
-              <w:t>2</w:t>
+              <w:t>1</w:t>
             </w:r>
           </w:p>
         </w:tc>
@@ -354,7 +354,7 @@
                 <w:sz w:val="22"/>
                 <w:u w:val="none"/>
               </w:rPr>
-              <w:t>At the end of 42 minutes I can classify matter as a pure substance or mixture and further distinguish between elements, ...</w:t>
+              <w:t>At the end of 42 minutes I can define and identify key concepts related to: classify matter as a pure substance or mixtu...</w:t>
             </w:r>
           </w:p>
         </w:tc>
@@ -396,7 +396,7 @@
                 <w:sz w:val="22"/>
                 <w:u w:val="none"/>
               </w:rPr>
-              <w:t>Physical vs. Chemical Properties and Changes</w:t>
+              <w:t>Classifying Matter: Pure Substances vs. Mixtures (Day 2 of 2)</w:t>
             </w:r>
           </w:p>
         </w:tc>
@@ -416,7 +416,7 @@
                 <w:sz w:val="22"/>
                 <w:u w:val="none"/>
               </w:rPr>
-              <w:t>3</w:t>
+              <w:t>1</w:t>
             </w:r>
           </w:p>
         </w:tc>
@@ -436,7 +436,7 @@
                 <w:sz w:val="22"/>
                 <w:u w:val="none"/>
               </w:rPr>
-              <w:t>At the end of 42 minutes I can distinguish between physical and chemical properties and identify evidence that a physica...</w:t>
+              <w:t>At the end of 42 minutes I can apply and analyze my understanding to classify matter as a pure substance or mixture and ...</w:t>
             </w:r>
           </w:p>
         </w:tc>
@@ -476,7 +476,7 @@
                 <w:sz w:val="22"/>
                 <w:u w:val="none"/>
               </w:rPr>
-              <w:t>Measurement, SI Units, and Significant Figures</w:t>
+              <w:t>Physical vs. Chemical Properties and Changes (Day 1 of 3)</w:t>
             </w:r>
           </w:p>
         </w:tc>
@@ -495,7 +495,7 @@
                 <w:sz w:val="22"/>
                 <w:u w:val="none"/>
               </w:rPr>
-              <w:t>2</w:t>
+              <w:t>1</w:t>
             </w:r>
           </w:p>
         </w:tc>
@@ -514,7 +514,7 @@
                 <w:sz w:val="22"/>
                 <w:u w:val="none"/>
               </w:rPr>
-              <w:t>At the end of 42 minutes I can take accurate measurements using appropriate SI units and express them with the correct n...</w:t>
+              <w:t>At the end of 42 minutes I can define and describe key concepts related to: distinguish between physical and chemical pr...</w:t>
             </w:r>
           </w:p>
         </w:tc>
@@ -556,7 +556,7 @@
                 <w:sz w:val="22"/>
                 <w:u w:val="none"/>
               </w:rPr>
-              <w:t>Lab Safety, Equipment, and Scientific Investigation</w:t>
+              <w:t>Physical vs. Chemical Properties and Changes (Day 2 of 3)</w:t>
             </w:r>
           </w:p>
         </w:tc>
@@ -576,7 +576,7 @@
                 <w:sz w:val="22"/>
                 <w:u w:val="none"/>
               </w:rPr>
-              <w:t>3</w:t>
+              <w:t>1</w:t>
             </w:r>
           </w:p>
         </w:tc>
@@ -596,7 +596,7 @@
                 <w:sz w:val="22"/>
                 <w:u w:val="none"/>
               </w:rPr>
-              <w:t>At the end of 42 minutes I can identify proper lab safety procedures, demonstrate correct use of common lab equipment, a...</w:t>
+              <w:t>At the end of 42 minutes I can apply and compare concepts and distinguish between physical and chemical properties and i...</w:t>
             </w:r>
           </w:p>
         </w:tc>
@@ -636,7 +636,7 @@
                 <w:sz w:val="22"/>
                 <w:u w:val="none"/>
               </w:rPr>
-              <w:t>Separation Techniques and Matter Review</w:t>
+              <w:t>Physical vs. Chemical Properties and Changes (Day 3 of 3)</w:t>
             </w:r>
           </w:p>
         </w:tc>
@@ -655,7 +655,7 @@
                 <w:sz w:val="22"/>
                 <w:u w:val="none"/>
               </w:rPr>
-              <w:t>2</w:t>
+              <w:t>1</w:t>
             </w:r>
           </w:p>
         </w:tc>
@@ -674,7 +674,569 @@
                 <w:sz w:val="22"/>
                 <w:u w:val="none"/>
               </w:rPr>
-              <w:t>At the end of 42 minutes I can select and justify an appropriate separation technique for a given mixture based on the p...</w:t>
+              <w:t>At the end of 42 minutes I can evaluate and explain my understanding to distinguish between physical and chemical proper...</w:t>
+            </w:r>
+          </w:p>
+        </w:tc>
+      </w:tr>
+      <w:tr>
+        <w:tc>
+          <w:tcPr>
+            <w:tcW w:type="dxa" w:w="1008"/>
+            <w:shd w:fill="F2F2F2" w:val="clear"/>
+          </w:tcPr>
+          <w:p>
+            <w:r/>
+            <w:r>
+              <w:rPr>
+                <w:rFonts w:ascii="Calibri" w:hAnsi="Calibri"/>
+                <w:b w:val="0"/>
+                <w:i w:val="0"/>
+                <w:color w:val="000000"/>
+                <w:sz w:val="22"/>
+                <w:u w:val="none"/>
+              </w:rPr>
+              <w:t>6</w:t>
+            </w:r>
+          </w:p>
+        </w:tc>
+        <w:tc>
+          <w:tcPr>
+            <w:tcW w:type="dxa" w:w="2880"/>
+            <w:shd w:fill="F2F2F2" w:val="clear"/>
+          </w:tcPr>
+          <w:p>
+            <w:r/>
+            <w:r>
+              <w:rPr>
+                <w:rFonts w:ascii="Calibri" w:hAnsi="Calibri"/>
+                <w:b w:val="0"/>
+                <w:i w:val="0"/>
+                <w:color w:val="000000"/>
+                <w:sz w:val="22"/>
+                <w:u w:val="none"/>
+              </w:rPr>
+              <w:t>Measurement, SI Units, and Significant Figures (Day 1 of 2)</w:t>
+            </w:r>
+          </w:p>
+        </w:tc>
+        <w:tc>
+          <w:tcPr>
+            <w:tcW w:type="dxa" w:w="864"/>
+            <w:shd w:fill="F2F2F2" w:val="clear"/>
+          </w:tcPr>
+          <w:p>
+            <w:r/>
+            <w:r>
+              <w:rPr>
+                <w:rFonts w:ascii="Calibri" w:hAnsi="Calibri"/>
+                <w:b w:val="0"/>
+                <w:i w:val="0"/>
+                <w:color w:val="000000"/>
+                <w:sz w:val="22"/>
+                <w:u w:val="none"/>
+              </w:rPr>
+              <w:t>1</w:t>
+            </w:r>
+          </w:p>
+        </w:tc>
+        <w:tc>
+          <w:tcPr>
+            <w:tcW w:type="dxa" w:w="5040"/>
+            <w:shd w:fill="F2F2F2" w:val="clear"/>
+          </w:tcPr>
+          <w:p>
+            <w:r/>
+            <w:r>
+              <w:rPr>
+                <w:rFonts w:ascii="Calibri" w:hAnsi="Calibri"/>
+                <w:b w:val="0"/>
+                <w:i w:val="0"/>
+                <w:color w:val="000000"/>
+                <w:sz w:val="22"/>
+                <w:u w:val="none"/>
+              </w:rPr>
+              <w:t>At the end of 42 minutes I can define and identify key concepts related to: take accurate measurements using appropriate...</w:t>
+            </w:r>
+          </w:p>
+        </w:tc>
+      </w:tr>
+      <w:tr>
+        <w:tc>
+          <w:tcPr>
+            <w:tcW w:type="dxa" w:w="1008"/>
+          </w:tcPr>
+          <w:p>
+            <w:r/>
+            <w:r>
+              <w:rPr>
+                <w:rFonts w:ascii="Calibri" w:hAnsi="Calibri"/>
+                <w:b w:val="0"/>
+                <w:i w:val="0"/>
+                <w:color w:val="000000"/>
+                <w:sz w:val="22"/>
+                <w:u w:val="none"/>
+              </w:rPr>
+              <w:t>7</w:t>
+            </w:r>
+          </w:p>
+        </w:tc>
+        <w:tc>
+          <w:tcPr>
+            <w:tcW w:type="dxa" w:w="2880"/>
+          </w:tcPr>
+          <w:p>
+            <w:r/>
+            <w:r>
+              <w:rPr>
+                <w:rFonts w:ascii="Calibri" w:hAnsi="Calibri"/>
+                <w:b w:val="0"/>
+                <w:i w:val="0"/>
+                <w:color w:val="000000"/>
+                <w:sz w:val="22"/>
+                <w:u w:val="none"/>
+              </w:rPr>
+              <w:t>Measurement, SI Units, and Significant Figures (Day 2 of 2)</w:t>
+            </w:r>
+          </w:p>
+        </w:tc>
+        <w:tc>
+          <w:tcPr>
+            <w:tcW w:type="dxa" w:w="864"/>
+          </w:tcPr>
+          <w:p>
+            <w:r/>
+            <w:r>
+              <w:rPr>
+                <w:rFonts w:ascii="Calibri" w:hAnsi="Calibri"/>
+                <w:b w:val="0"/>
+                <w:i w:val="0"/>
+                <w:color w:val="000000"/>
+                <w:sz w:val="22"/>
+                <w:u w:val="none"/>
+              </w:rPr>
+              <w:t>1</w:t>
+            </w:r>
+          </w:p>
+        </w:tc>
+        <w:tc>
+          <w:tcPr>
+            <w:tcW w:type="dxa" w:w="5040"/>
+          </w:tcPr>
+          <w:p>
+            <w:r/>
+            <w:r>
+              <w:rPr>
+                <w:rFonts w:ascii="Calibri" w:hAnsi="Calibri"/>
+                <w:b w:val="0"/>
+                <w:i w:val="0"/>
+                <w:color w:val="000000"/>
+                <w:sz w:val="22"/>
+                <w:u w:val="none"/>
+              </w:rPr>
+              <w:t>At the end of 42 minutes I can apply and analyze my understanding to take accurate measurements using appropriate SI uni...</w:t>
+            </w:r>
+          </w:p>
+        </w:tc>
+      </w:tr>
+      <w:tr>
+        <w:tc>
+          <w:tcPr>
+            <w:tcW w:type="dxa" w:w="1008"/>
+            <w:shd w:fill="F2F2F2" w:val="clear"/>
+          </w:tcPr>
+          <w:p>
+            <w:r/>
+            <w:r>
+              <w:rPr>
+                <w:rFonts w:ascii="Calibri" w:hAnsi="Calibri"/>
+                <w:b w:val="0"/>
+                <w:i w:val="0"/>
+                <w:color w:val="000000"/>
+                <w:sz w:val="22"/>
+                <w:u w:val="none"/>
+              </w:rPr>
+              <w:t>8</w:t>
+            </w:r>
+          </w:p>
+        </w:tc>
+        <w:tc>
+          <w:tcPr>
+            <w:tcW w:type="dxa" w:w="2880"/>
+            <w:shd w:fill="F2F2F2" w:val="clear"/>
+          </w:tcPr>
+          <w:p>
+            <w:r/>
+            <w:r>
+              <w:rPr>
+                <w:rFonts w:ascii="Calibri" w:hAnsi="Calibri"/>
+                <w:b w:val="0"/>
+                <w:i w:val="0"/>
+                <w:color w:val="000000"/>
+                <w:sz w:val="22"/>
+                <w:u w:val="none"/>
+              </w:rPr>
+              <w:t>Lab Safety, Equipment, and Scientific Investigation (Day 1 of 3)</w:t>
+            </w:r>
+          </w:p>
+        </w:tc>
+        <w:tc>
+          <w:tcPr>
+            <w:tcW w:type="dxa" w:w="864"/>
+            <w:shd w:fill="F2F2F2" w:val="clear"/>
+          </w:tcPr>
+          <w:p>
+            <w:r/>
+            <w:r>
+              <w:rPr>
+                <w:rFonts w:ascii="Calibri" w:hAnsi="Calibri"/>
+                <w:b w:val="0"/>
+                <w:i w:val="0"/>
+                <w:color w:val="000000"/>
+                <w:sz w:val="22"/>
+                <w:u w:val="none"/>
+              </w:rPr>
+              <w:t>1</w:t>
+            </w:r>
+          </w:p>
+        </w:tc>
+        <w:tc>
+          <w:tcPr>
+            <w:tcW w:type="dxa" w:w="5040"/>
+            <w:shd w:fill="F2F2F2" w:val="clear"/>
+          </w:tcPr>
+          <w:p>
+            <w:r/>
+            <w:r>
+              <w:rPr>
+                <w:rFonts w:ascii="Calibri" w:hAnsi="Calibri"/>
+                <w:b w:val="0"/>
+                <w:i w:val="0"/>
+                <w:color w:val="000000"/>
+                <w:sz w:val="22"/>
+                <w:u w:val="none"/>
+              </w:rPr>
+              <w:t>At the end of 42 minutes I can define and describe key concepts related to: identify proper lab safety procedures, demon...</w:t>
+            </w:r>
+          </w:p>
+        </w:tc>
+      </w:tr>
+      <w:tr>
+        <w:tc>
+          <w:tcPr>
+            <w:tcW w:type="dxa" w:w="1008"/>
+          </w:tcPr>
+          <w:p>
+            <w:r/>
+            <w:r>
+              <w:rPr>
+                <w:rFonts w:ascii="Calibri" w:hAnsi="Calibri"/>
+                <w:b w:val="0"/>
+                <w:i w:val="0"/>
+                <w:color w:val="000000"/>
+                <w:sz w:val="22"/>
+                <w:u w:val="none"/>
+              </w:rPr>
+              <w:t>9</w:t>
+            </w:r>
+          </w:p>
+        </w:tc>
+        <w:tc>
+          <w:tcPr>
+            <w:tcW w:type="dxa" w:w="2880"/>
+          </w:tcPr>
+          <w:p>
+            <w:r/>
+            <w:r>
+              <w:rPr>
+                <w:rFonts w:ascii="Calibri" w:hAnsi="Calibri"/>
+                <w:b w:val="0"/>
+                <w:i w:val="0"/>
+                <w:color w:val="000000"/>
+                <w:sz w:val="22"/>
+                <w:u w:val="none"/>
+              </w:rPr>
+              <w:t>Lab Safety, Equipment, and Scientific Investigation (Day 2 of 3)</w:t>
+            </w:r>
+          </w:p>
+        </w:tc>
+        <w:tc>
+          <w:tcPr>
+            <w:tcW w:type="dxa" w:w="864"/>
+          </w:tcPr>
+          <w:p>
+            <w:r/>
+            <w:r>
+              <w:rPr>
+                <w:rFonts w:ascii="Calibri" w:hAnsi="Calibri"/>
+                <w:b w:val="0"/>
+                <w:i w:val="0"/>
+                <w:color w:val="000000"/>
+                <w:sz w:val="22"/>
+                <w:u w:val="none"/>
+              </w:rPr>
+              <w:t>1</w:t>
+            </w:r>
+          </w:p>
+        </w:tc>
+        <w:tc>
+          <w:tcPr>
+            <w:tcW w:type="dxa" w:w="5040"/>
+          </w:tcPr>
+          <w:p>
+            <w:r/>
+            <w:r>
+              <w:rPr>
+                <w:rFonts w:ascii="Calibri" w:hAnsi="Calibri"/>
+                <w:b w:val="0"/>
+                <w:i w:val="0"/>
+                <w:color w:val="000000"/>
+                <w:sz w:val="22"/>
+                <w:u w:val="none"/>
+              </w:rPr>
+              <w:t>At the end of 42 minutes I can apply and compare concepts and identify proper lab safety procedures, demonstrate correct...</w:t>
+            </w:r>
+          </w:p>
+        </w:tc>
+      </w:tr>
+      <w:tr>
+        <w:tc>
+          <w:tcPr>
+            <w:tcW w:type="dxa" w:w="1008"/>
+            <w:shd w:fill="F2F2F2" w:val="clear"/>
+          </w:tcPr>
+          <w:p>
+            <w:r/>
+            <w:r>
+              <w:rPr>
+                <w:rFonts w:ascii="Calibri" w:hAnsi="Calibri"/>
+                <w:b w:val="0"/>
+                <w:i w:val="0"/>
+                <w:color w:val="000000"/>
+                <w:sz w:val="22"/>
+                <w:u w:val="none"/>
+              </w:rPr>
+              <w:t>10</w:t>
+            </w:r>
+          </w:p>
+        </w:tc>
+        <w:tc>
+          <w:tcPr>
+            <w:tcW w:type="dxa" w:w="2880"/>
+            <w:shd w:fill="F2F2F2" w:val="clear"/>
+          </w:tcPr>
+          <w:p>
+            <w:r/>
+            <w:r>
+              <w:rPr>
+                <w:rFonts w:ascii="Calibri" w:hAnsi="Calibri"/>
+                <w:b w:val="0"/>
+                <w:i w:val="0"/>
+                <w:color w:val="000000"/>
+                <w:sz w:val="22"/>
+                <w:u w:val="none"/>
+              </w:rPr>
+              <w:t>Lab Safety, Equipment, and Scientific Investigation (Day 3 of 3)</w:t>
+            </w:r>
+          </w:p>
+        </w:tc>
+        <w:tc>
+          <w:tcPr>
+            <w:tcW w:type="dxa" w:w="864"/>
+            <w:shd w:fill="F2F2F2" w:val="clear"/>
+          </w:tcPr>
+          <w:p>
+            <w:r/>
+            <w:r>
+              <w:rPr>
+                <w:rFonts w:ascii="Calibri" w:hAnsi="Calibri"/>
+                <w:b w:val="0"/>
+                <w:i w:val="0"/>
+                <w:color w:val="000000"/>
+                <w:sz w:val="22"/>
+                <w:u w:val="none"/>
+              </w:rPr>
+              <w:t>1</w:t>
+            </w:r>
+          </w:p>
+        </w:tc>
+        <w:tc>
+          <w:tcPr>
+            <w:tcW w:type="dxa" w:w="5040"/>
+            <w:shd w:fill="F2F2F2" w:val="clear"/>
+          </w:tcPr>
+          <w:p>
+            <w:r/>
+            <w:r>
+              <w:rPr>
+                <w:rFonts w:ascii="Calibri" w:hAnsi="Calibri"/>
+                <w:b w:val="0"/>
+                <w:i w:val="0"/>
+                <w:color w:val="000000"/>
+                <w:sz w:val="22"/>
+                <w:u w:val="none"/>
+              </w:rPr>
+              <w:t>At the end of 42 minutes I can evaluate and explain my understanding to identify proper lab safety procedures, demonstra...</w:t>
+            </w:r>
+          </w:p>
+        </w:tc>
+      </w:tr>
+      <w:tr>
+        <w:tc>
+          <w:tcPr>
+            <w:tcW w:type="dxa" w:w="1008"/>
+          </w:tcPr>
+          <w:p>
+            <w:r/>
+            <w:r>
+              <w:rPr>
+                <w:rFonts w:ascii="Calibri" w:hAnsi="Calibri"/>
+                <w:b w:val="0"/>
+                <w:i w:val="0"/>
+                <w:color w:val="000000"/>
+                <w:sz w:val="22"/>
+                <w:u w:val="none"/>
+              </w:rPr>
+              <w:t>11</w:t>
+            </w:r>
+          </w:p>
+        </w:tc>
+        <w:tc>
+          <w:tcPr>
+            <w:tcW w:type="dxa" w:w="2880"/>
+          </w:tcPr>
+          <w:p>
+            <w:r/>
+            <w:r>
+              <w:rPr>
+                <w:rFonts w:ascii="Calibri" w:hAnsi="Calibri"/>
+                <w:b w:val="0"/>
+                <w:i w:val="0"/>
+                <w:color w:val="000000"/>
+                <w:sz w:val="22"/>
+                <w:u w:val="none"/>
+              </w:rPr>
+              <w:t>Separation Techniques and Matter Review (Day 1 of 2)</w:t>
+            </w:r>
+          </w:p>
+        </w:tc>
+        <w:tc>
+          <w:tcPr>
+            <w:tcW w:type="dxa" w:w="864"/>
+          </w:tcPr>
+          <w:p>
+            <w:r/>
+            <w:r>
+              <w:rPr>
+                <w:rFonts w:ascii="Calibri" w:hAnsi="Calibri"/>
+                <w:b w:val="0"/>
+                <w:i w:val="0"/>
+                <w:color w:val="000000"/>
+                <w:sz w:val="22"/>
+                <w:u w:val="none"/>
+              </w:rPr>
+              <w:t>1</w:t>
+            </w:r>
+          </w:p>
+        </w:tc>
+        <w:tc>
+          <w:tcPr>
+            <w:tcW w:type="dxa" w:w="5040"/>
+          </w:tcPr>
+          <w:p>
+            <w:r/>
+            <w:r>
+              <w:rPr>
+                <w:rFonts w:ascii="Calibri" w:hAnsi="Calibri"/>
+                <w:b w:val="0"/>
+                <w:i w:val="0"/>
+                <w:color w:val="000000"/>
+                <w:sz w:val="22"/>
+                <w:u w:val="none"/>
+              </w:rPr>
+              <w:t>At the end of 42 minutes I can define and identify key concepts related to: select and justify an appropriate separation...</w:t>
+            </w:r>
+          </w:p>
+        </w:tc>
+      </w:tr>
+      <w:tr>
+        <w:tc>
+          <w:tcPr>
+            <w:tcW w:type="dxa" w:w="1008"/>
+            <w:shd w:fill="F2F2F2" w:val="clear"/>
+          </w:tcPr>
+          <w:p>
+            <w:r/>
+            <w:r>
+              <w:rPr>
+                <w:rFonts w:ascii="Calibri" w:hAnsi="Calibri"/>
+                <w:b w:val="0"/>
+                <w:i w:val="0"/>
+                <w:color w:val="000000"/>
+                <w:sz w:val="22"/>
+                <w:u w:val="none"/>
+              </w:rPr>
+              <w:t>12</w:t>
+            </w:r>
+          </w:p>
+        </w:tc>
+        <w:tc>
+          <w:tcPr>
+            <w:tcW w:type="dxa" w:w="2880"/>
+            <w:shd w:fill="F2F2F2" w:val="clear"/>
+          </w:tcPr>
+          <w:p>
+            <w:r/>
+            <w:r>
+              <w:rPr>
+                <w:rFonts w:ascii="Calibri" w:hAnsi="Calibri"/>
+                <w:b w:val="0"/>
+                <w:i w:val="0"/>
+                <w:color w:val="000000"/>
+                <w:sz w:val="22"/>
+                <w:u w:val="none"/>
+              </w:rPr>
+              <w:t>Separation Techniques and Matter Review (Day 2 of 2)</w:t>
+            </w:r>
+          </w:p>
+        </w:tc>
+        <w:tc>
+          <w:tcPr>
+            <w:tcW w:type="dxa" w:w="864"/>
+            <w:shd w:fill="F2F2F2" w:val="clear"/>
+          </w:tcPr>
+          <w:p>
+            <w:r/>
+            <w:r>
+              <w:rPr>
+                <w:rFonts w:ascii="Calibri" w:hAnsi="Calibri"/>
+                <w:b w:val="0"/>
+                <w:i w:val="0"/>
+                <w:color w:val="000000"/>
+                <w:sz w:val="22"/>
+                <w:u w:val="none"/>
+              </w:rPr>
+              <w:t>1</w:t>
+            </w:r>
+          </w:p>
+        </w:tc>
+        <w:tc>
+          <w:tcPr>
+            <w:tcW w:type="dxa" w:w="5040"/>
+            <w:shd w:fill="F2F2F2" w:val="clear"/>
+          </w:tcPr>
+          <w:p>
+            <w:r/>
+            <w:r>
+              <w:rPr>
+                <w:rFonts w:ascii="Calibri" w:hAnsi="Calibri"/>
+                <w:b w:val="0"/>
+                <w:i w:val="0"/>
+                <w:color w:val="000000"/>
+                <w:sz w:val="22"/>
+                <w:u w:val="none"/>
+              </w:rPr>
+              <w:t>At the end of 42 minutes I can apply and analyze my understanding to select and justify an appropriate separation techni...</w:t>
             </w:r>
           </w:p>
         </w:tc>

</xml_diff>